<commit_message>
Add actual deployed Kataria gallery art exhibits showcase and zone mappings to README
</commit_message>
<xml_diff>
--- a/Arduino_Challenge_Project_Report_Filled.docx
+++ b/Arduino_Challenge_Project_Report_Filled.docx
@@ -224,7 +224,7 @@
           </w:tcPr>
           <w:p>
             <w:r>
-              <w:t>IND-2026-AI-8492</w:t>
+              <w:t>APC-2026-GJ-67690</w:t>
             </w:r>
           </w:p>
         </w:tc>
@@ -330,7 +330,7 @@
           </w:tcPr>
           <w:p>
             <w:r>
-              <w:t>Kataria Arcade (10th Floor), Ahmedabad, Gujarat, India</w:t>
+              <w:t>Government Polytechnic Ahmedabad 380015</w:t>
             </w:r>
           </w:p>
         </w:tc>
@@ -501,7 +501,16 @@
           </w:tcPr>
           <w:p>
             <w:r>
-              <w:t>sujaypatel.eng@gmail.com</w:t>
+              <w:t>S</w:t>
+            </w:r>
+            <w:r>
+              <w:t>ujaypatel</w:t>
+            </w:r>
+            <w:r>
+              <w:t xml:space="preserve">07 </w:t>
+            </w:r>
+            <w:r>
+              <w:t>@gmail.com</w:t>
             </w:r>
           </w:p>
         </w:tc>
@@ -771,8 +780,6 @@
       <w:r>
         <w:rPr>
           <w:rFonts w:ascii="Calibri" w:hAnsi="Calibri"/>
-          <w:b w:val="0"/>
-          <w:i w:val="0"/>
           <w:sz w:val="21"/>
         </w:rPr>
         <w:t>In commercial art galleries, exhibition centers, and architectural corporate lobbies, conventional lighting systems operate continuously at full power across all fixtures regardless of visitor presence. This results in severe electrical power wastage (up to 70% during off-peak hours), shortened LED spotlight operating life, and a static, non-engaging environment for art visitors. The Sandhi Cement Art Gallery located on the 10th floor of Kataria Arcade requires an intelligent, physical automation system that dynamically tracks visitor trajectories to spotlight art in real time while seamlessly transitioning into a low-power ambient sweep mode during vacant intervals.</w:t>
@@ -845,11 +852,17 @@
       <w:r>
         <w:rPr>
           <w:rFonts w:ascii="Calibri" w:hAnsi="Calibri"/>
-          <w:b w:val="0"/>
-          <w:i w:val="0"/>
           <w:sz w:val="21"/>
         </w:rPr>
-        <w:t>Sandhi Lumina is an industrial-grade, interactive lighting automation system designed for corporate art galleries. The system uses a synchronized 4-zone array of Sharp GP2Y0A02YK0F optical infrared distance sensors connected to an Arduino® UNO™ Q. When a visitor approaches any of the four designated gallery zones, the sensor array captures real-time distance measurements (20cm to 150cm). The onboard STM32 microcontroller processes these analog signals, filters ambient noise, and executes a state-machine that triggers an 8-channel optocoupler-isolated relay board. This selectively powers 10W high-CRI COB LED spotlights directly focused on the artwork being viewed, while simultaneously rendering spatial visitor location diagnostics on the Uno Q's onboard 8x13 LED Matrix. When no visitor is detected for over 5 seconds, the system automatically enters an energy-saving 'zigzag sweep' standby mode, creating captivating ambient aesthetics while significantly lowering overall facility energy consumption.</w:t>
+        <w:t xml:space="preserve">Sandhi Lumina is an industrial-grade, interactive lighting automation system designed for corporate art galleries. The system uses a synchronized 4-zone array of Sharp GP2Y0A02YK0F optical infrared distance </w:t>
+      </w:r>
+      <w:r>
+        <w:rPr>
+          <w:rFonts w:ascii="Calibri" w:hAnsi="Calibri"/>
+          <w:sz w:val="21"/>
+        </w:rPr>
+        <w:lastRenderedPageBreak/>
+        <w:t>sensors connected to an Arduino® UNO™ Q. When a visitor approaches any of the four designated gallery zones, the sensor array captures real-time distance measurements (20cm to 150cm). The onboard STM32 microcontroller processes these analog signals, filters ambient noise, and executes a state-machine that triggers an 8-channel optocoupler-isolated relay board. This selectively powers 10W high-CRI COB LED spotlights directly focused on the artwork being viewed, while simultaneously rendering spatial visitor location diagnostics on the Uno Q's onboard 8x13 LED Matrix. When no visitor is detected for over 5 seconds, the system automatically enters an energy-saving 'zigzag sweep' standby mode, creating captivating ambient aesthetics while significantly lowering overall facility energy consumption.</w:t>
       </w:r>
     </w:p>
     <w:p>
@@ -928,7 +941,6 @@
           <w:sz w:val="20"/>
           <w:szCs w:val="20"/>
         </w:rPr>
-        <w:lastRenderedPageBreak/>
         <w:t>How does its on-device AI capability enable your solution?</w:t>
       </w:r>
     </w:p>
@@ -942,8 +954,6 @@
       <w:r>
         <w:rPr>
           <w:rFonts w:ascii="Calibri" w:hAnsi="Calibri"/>
-          <w:b w:val="0"/>
-          <w:i w:val="0"/>
           <w:sz w:val="21"/>
         </w:rPr>
         <w:t>The Arduino® UNO™ Q provides a powerful hybrid architecture combining an ultra-low-power STM32 microcontroller with a high-performance Qualcomm microprocessor. For this Physical AI deployment, the high-speed ADC and deterministic GPIO control of the MCU handle real-time analog sensor filtering and high-voltage AC relay switching with sub-millisecond latency. Concurrently, the integrated 8x13 LED matrix provides instant visual diagnostic feedback of visitor tracking zones without requiring external monitors. This edge-computing capability ensures continuous, reliable operation, high energy efficiency, and immunity from network latencies in commercial environments.</w:t>
@@ -1327,7 +1337,7 @@
       <w:tr>
         <w:tc>
           <w:tcPr>
-            <w:tcW w:type="dxa" w:w="6181"/>
+            <w:tcW w:w="6181" w:type="dxa"/>
           </w:tcPr>
           <w:p>
             <w:r>
@@ -1337,7 +1347,7 @@
         </w:tc>
         <w:tc>
           <w:tcPr>
-            <w:tcW w:type="dxa" w:w="2318"/>
+            <w:tcW w:w="2318" w:type="dxa"/>
           </w:tcPr>
           <w:p>
             <w:r>
@@ -1349,7 +1359,7 @@
       <w:tr>
         <w:tc>
           <w:tcPr>
-            <w:tcW w:type="dxa" w:w="6181"/>
+            <w:tcW w:w="6181" w:type="dxa"/>
           </w:tcPr>
           <w:p>
             <w:r>
@@ -1359,7 +1369,7 @@
         </w:tc>
         <w:tc>
           <w:tcPr>
-            <w:tcW w:type="dxa" w:w="2318"/>
+            <w:tcW w:w="2318" w:type="dxa"/>
           </w:tcPr>
           <w:p>
             <w:r>
@@ -1371,17 +1381,18 @@
       <w:tr>
         <w:tc>
           <w:tcPr>
-            <w:tcW w:type="dxa" w:w="6181"/>
-          </w:tcPr>
-          <w:p>
-            <w:r>
+            <w:tcW w:w="6181" w:type="dxa"/>
+          </w:tcPr>
+          <w:p>
+            <w:r>
+              <w:lastRenderedPageBreak/>
               <w:t>Custom Laser-Cut Acrylic Enclosure &amp; M3 Brass Standoffs Kit</w:t>
             </w:r>
           </w:p>
         </w:tc>
         <w:tc>
           <w:tcPr>
-            <w:tcW w:type="dxa" w:w="2318"/>
+            <w:tcW w:w="2318" w:type="dxa"/>
           </w:tcPr>
           <w:p>
             <w:r>
@@ -1393,7 +1404,7 @@
       <w:tr>
         <w:tc>
           <w:tcPr>
-            <w:tcW w:type="dxa" w:w="6181"/>
+            <w:tcW w:w="6181" w:type="dxa"/>
           </w:tcPr>
           <w:p>
             <w:r>
@@ -1403,7 +1414,7 @@
         </w:tc>
         <w:tc>
           <w:tcPr>
-            <w:tcW w:type="dxa" w:w="2318"/>
+            <w:tcW w:w="2318" w:type="dxa"/>
           </w:tcPr>
           <w:p>
             <w:r>
@@ -1454,17 +1465,39 @@
       <w:r>
         <w:rPr>
           <w:rFonts w:ascii="Calibri" w:hAnsi="Calibri"/>
-          <w:b w:val="0"/>
-          <w:i w:val="0"/>
           <w:sz w:val="20"/>
         </w:rPr>
         <w:t>1. Sensing &amp; Edge Acquisition: The 4x Sharp GP2Y0A02YK0F IR sensors continuously sample analog proximity levels (Pins A2–A5) across 4 spatial gallery zones at 100 Hz.</w:t>
+      </w:r>
+      <w:r>
+        <w:rPr>
+          <w:rFonts w:ascii="Calibri" w:hAnsi="Calibri"/>
+          <w:sz w:val="20"/>
+        </w:rPr>
         <w:br/>
         <w:t>2. Signal Filtering &amp; Spatial Regression: The Uno Q applies inverse-voltage mathematical calibration curves on-device to compute exact distances (20cm to 150cm) and classify zone occupancy.</w:t>
+      </w:r>
+      <w:r>
+        <w:rPr>
+          <w:rFonts w:ascii="Calibri" w:hAnsi="Calibri"/>
+          <w:sz w:val="20"/>
+        </w:rPr>
         <w:br/>
         <w:t>3. Optoisolated Dynamic Switching: The STM32 MCU drives digital GPIO lines (D3, D5, D7, D9, D10, D12, D13) into the 8-channel relay board, toggling 220V AC lines for the corresponding 10W spotlights.</w:t>
+      </w:r>
+      <w:r>
+        <w:rPr>
+          <w:rFonts w:ascii="Calibri" w:hAnsi="Calibri"/>
+          <w:sz w:val="20"/>
+        </w:rPr>
         <w:br/>
         <w:t>4. On-Board Diagnostic Rendering: The 8x13 LED Matrix displays real-time bitmapped zone visualization maps corresponding to visitor positions.</w:t>
+      </w:r>
+      <w:r>
+        <w:rPr>
+          <w:rFonts w:ascii="Calibri" w:hAnsi="Calibri"/>
+          <w:sz w:val="20"/>
+        </w:rPr>
         <w:br/>
         <w:t>5. Standby Energy Optimization: When all zones read clear for &gt;5 seconds, the controller transitions to an automated 'zigzag sweep' animation, reducing power draw by 62%.</w:t>
       </w:r>
@@ -1559,24 +1592,28 @@
         <w:spacing w:before="120" w:after="120"/>
         <w:jc w:val="center"/>
       </w:pPr>
-      <w:r/>
-      <w:r>
+      <w:r>
+        <w:rPr>
+          <w:noProof/>
+        </w:rPr>
+        <w:lastRenderedPageBreak/>
         <w:drawing>
-          <wp:inline xmlns:a="http://schemas.openxmlformats.org/drawingml/2006/main" xmlns:pic="http://schemas.openxmlformats.org/drawingml/2006/picture">
+          <wp:inline distT="0" distB="0" distL="0" distR="0" wp14:anchorId="7C336429" wp14:editId="5A967C9E">
             <wp:extent cx="4114800" cy="5354710"/>
+            <wp:effectExtent l="0" t="0" r="0" b="0"/>
             <wp:docPr id="1" name="Picture 1"/>
             <wp:cNvGraphicFramePr>
-              <a:graphicFrameLocks noChangeAspect="1"/>
+              <a:graphicFrameLocks xmlns:a="http://schemas.openxmlformats.org/drawingml/2006/main" noChangeAspect="1"/>
             </wp:cNvGraphicFramePr>
-            <a:graphic>
+            <a:graphic xmlns:a="http://schemas.openxmlformats.org/drawingml/2006/main">
               <a:graphicData uri="http://schemas.openxmlformats.org/drawingml/2006/picture">
-                <pic:pic>
+                <pic:pic xmlns:pic="http://schemas.openxmlformats.org/drawingml/2006/picture">
                   <pic:nvPicPr>
                     <pic:cNvPr id="0" name="circuit_schematic.png"/>
                     <pic:cNvPicPr/>
                   </pic:nvPicPr>
                   <pic:blipFill>
-                    <a:blip r:embed="rId7"/>
+                    <a:blip r:embed="rId5"/>
                     <a:stretch>
                       <a:fillRect/>
                     </a:stretch>
@@ -1586,7 +1623,9 @@
                       <a:off x="0" y="0"/>
                       <a:ext cx="4114800" cy="5354710"/>
                     </a:xfrm>
-                    <a:prstGeom prst="rect"/>
+                    <a:prstGeom prst="rect">
+                      <a:avLst/>
+                    </a:prstGeom>
                   </pic:spPr>
                 </pic:pic>
               </a:graphicData>
@@ -1602,7 +1641,6 @@
       <w:r>
         <w:rPr>
           <w:rFonts w:ascii="Calibri" w:hAnsi="Calibri"/>
-          <w:b w:val="0"/>
           <w:i/>
           <w:sz w:val="18"/>
         </w:rPr>
@@ -1785,7 +1823,6 @@
                 <w:sz w:val="20"/>
                 <w:szCs w:val="20"/>
               </w:rPr>
-              <w:lastRenderedPageBreak/>
               <w:t>Accuracy</w:t>
             </w:r>
           </w:p>
@@ -1877,6 +1914,7 @@
         <w:pStyle w:val="Heading2"/>
       </w:pPr>
       <w:r>
+        <w:lastRenderedPageBreak/>
         <w:t>Brief Description &amp; Limitations</w:t>
       </w:r>
     </w:p>
@@ -1905,12 +1943,22 @@
       <w:r>
         <w:rPr>
           <w:rFonts w:ascii="Calibri" w:hAnsi="Calibri"/>
-          <w:b w:val="0"/>
-          <w:i w:val="0"/>
           <w:sz w:val="21"/>
         </w:rPr>
         <w:t>The system implements an on-device mathematical regression and spatial filtering algorithm tailored to Sharp infrared triangulation sensors. The transfer function maps analog ADC voltages into precise linear distance coordinates, compensating for ambient optical noise and sensor nonlinearity.</w:t>
+      </w:r>
+      <w:r>
+        <w:rPr>
+          <w:rFonts w:ascii="Calibri" w:hAnsi="Calibri"/>
+          <w:sz w:val="21"/>
+        </w:rPr>
         <w:br/>
+      </w:r>
+      <w:r>
+        <w:rPr>
+          <w:rFonts w:ascii="Calibri" w:hAnsi="Calibri"/>
+          <w:sz w:val="21"/>
+        </w:rPr>
         <w:br/>
         <w:t>Limitations: Optical IR triangulation can experience reduced range when encountering highly absorbent (pure matte black) clothing or direct solar infrared saturation. These limitations are mitigated by setting wide sensor overlap thresholds and installing sensors beneath overhead diffuser baffles.</w:t>
       </w:r>
@@ -1958,9 +2006,9 @@
           <w:sz w:val="20"/>
           <w:szCs w:val="20"/>
         </w:rPr>
-        <w:t xml:space="preserve">Briefly explain the main functions. Example: setup() → initialises sensors; loop() → main execution; </w:t>
-      </w:r>
-      <w:proofErr w:type="spellStart"/>
+        <w:t xml:space="preserve">Briefly explain the main functions. Example: </w:t>
+      </w:r>
+      <w:proofErr w:type="gramStart"/>
       <w:r>
         <w:rPr>
           <w:i/>
@@ -1969,9 +2017,9 @@
           <w:sz w:val="20"/>
           <w:szCs w:val="20"/>
         </w:rPr>
-        <w:t>detectObject</w:t>
-      </w:r>
-      <w:proofErr w:type="spellEnd"/>
+        <w:t>setup(</w:t>
+      </w:r>
+      <w:proofErr w:type="gramEnd"/>
       <w:r>
         <w:rPr>
           <w:i/>
@@ -1980,7 +2028,63 @@
           <w:sz w:val="20"/>
           <w:szCs w:val="20"/>
         </w:rPr>
-        <w:t>() → detection logic.</w:t>
+        <w:t xml:space="preserve">) → initialises sensors; </w:t>
+      </w:r>
+      <w:proofErr w:type="gramStart"/>
+      <w:r>
+        <w:rPr>
+          <w:i/>
+          <w:iCs/>
+          <w:color w:val="666666"/>
+          <w:sz w:val="20"/>
+          <w:szCs w:val="20"/>
+        </w:rPr>
+        <w:t>loop(</w:t>
+      </w:r>
+      <w:proofErr w:type="gramEnd"/>
+      <w:r>
+        <w:rPr>
+          <w:i/>
+          <w:iCs/>
+          <w:color w:val="666666"/>
+          <w:sz w:val="20"/>
+          <w:szCs w:val="20"/>
+        </w:rPr>
+        <w:t xml:space="preserve">) → main execution; </w:t>
+      </w:r>
+      <w:proofErr w:type="spellStart"/>
+      <w:proofErr w:type="gramStart"/>
+      <w:r>
+        <w:rPr>
+          <w:i/>
+          <w:iCs/>
+          <w:color w:val="666666"/>
+          <w:sz w:val="20"/>
+          <w:szCs w:val="20"/>
+        </w:rPr>
+        <w:t>detectObject</w:t>
+      </w:r>
+      <w:proofErr w:type="spellEnd"/>
+      <w:r>
+        <w:rPr>
+          <w:i/>
+          <w:iCs/>
+          <w:color w:val="666666"/>
+          <w:sz w:val="20"/>
+          <w:szCs w:val="20"/>
+        </w:rPr>
+        <w:t>(</w:t>
+      </w:r>
+      <w:proofErr w:type="gramEnd"/>
+      <w:r>
+        <w:rPr>
+          <w:i/>
+          <w:iCs/>
+          <w:color w:val="666666"/>
+          <w:sz w:val="20"/>
+          <w:szCs w:val="20"/>
+        </w:rPr>
+        <w:t>) → detection logic.</w:t>
       </w:r>
     </w:p>
     <w:p>
@@ -1993,17 +2097,39 @@
       <w:r>
         <w:rPr>
           <w:rFonts w:ascii="Calibri" w:hAnsi="Calibri"/>
-          <w:b w:val="0"/>
-          <w:i w:val="0"/>
           <w:sz w:val="20"/>
         </w:rPr>
         <w:t>• setup(): Initializes serial communication (9600 baud), configures relay control GPIO pins (Pins 3, 5, 7, 9, 10, 12, 13) as OUTPUTs with safe initial states, configures Pin 1 as digital trigger INPUT, and starts the LED matrix.</w:t>
+      </w:r>
+      <w:r>
+        <w:rPr>
+          <w:rFonts w:ascii="Calibri" w:hAnsi="Calibri"/>
+          <w:sz w:val="20"/>
+        </w:rPr>
         <w:br/>
         <w:t>• loop(): Reads Pin 1 digital run-state; when active, executes the main sensor tracking loop and monitors the 5-second inactivity timeout.</w:t>
+      </w:r>
+      <w:r>
+        <w:rPr>
+          <w:rFonts w:ascii="Calibri" w:hAnsi="Calibri"/>
+          <w:sz w:val="20"/>
+        </w:rPr>
         <w:br/>
         <w:t>• sensor.distance(): Samples raw analog voltage from Sharp IR sensors and calculates real-time distance in centimeters using model 100500 transfer curves.</w:t>
+      </w:r>
+      <w:r>
+        <w:rPr>
+          <w:rFonts w:ascii="Calibri" w:hAnsi="Calibri"/>
+          <w:sz w:val="20"/>
+        </w:rPr>
         <w:br/>
         <w:t>• Relay State Machine: Evaluates distance measurements against calibrated zone thresholds (120cm, 130cm, 150cm, 160cm) to selectively illuminate spotlights.</w:t>
+      </w:r>
+      <w:r>
+        <w:rPr>
+          <w:rFonts w:ascii="Calibri" w:hAnsi="Calibri"/>
+          <w:sz w:val="20"/>
+        </w:rPr>
         <w:br/>
         <w:t>• zigzag(): Executes an automated 13-column animated sweep on the LED matrix while sequencing relays in an energy-efficient ambient lighting pattern during gallery idle mode.</w:t>
       </w:r>
@@ -2164,7 +2290,7 @@
           </w:tcPr>
           <w:p>
             <w:r>
-              <w:t>https://github.com/Sujay-Patel-GitHub/Robu-Hacktahon-Uno-Q/raw/main/media/videos/Lighting%20Human%20Detection%20Video.mp4</w:t>
+              <w:t>https://youtu.be/4SrIIOJpTuI</w:t>
             </w:r>
           </w:p>
         </w:tc>
@@ -2203,20 +2329,62 @@
       <w:r>
         <w:rPr>
           <w:rFonts w:ascii="Calibri" w:hAnsi="Calibri"/>
-          <w:b w:val="0"/>
-          <w:i w:val="0"/>
           <w:sz w:val="20"/>
         </w:rPr>
         <w:t>The complete system was rigorously bench-tested and deployed in the Kataria Arcade 10th-floor gallery over a continuous 48-hour burn-in evaluation. Test parameters included single-visitor traversals, multi-visitor simultaneous dwell times, and edge-case boundary crossings.</w:t>
+      </w:r>
+      <w:r>
+        <w:rPr>
+          <w:rFonts w:ascii="Calibri" w:hAnsi="Calibri"/>
+          <w:sz w:val="20"/>
+        </w:rPr>
         <w:br/>
+      </w:r>
+      <w:r>
+        <w:rPr>
+          <w:rFonts w:ascii="Calibri" w:hAnsi="Calibri"/>
+          <w:sz w:val="20"/>
+        </w:rPr>
         <w:br/>
         <w:t>Key Results:</w:t>
+      </w:r>
+      <w:r>
+        <w:rPr>
+          <w:rFonts w:ascii="Calibri" w:hAnsi="Calibri"/>
+          <w:sz w:val="20"/>
+        </w:rPr>
         <w:br/>
         <w:t>• Response Time: &lt;45 ms from sensor proximity detection to full spotlight relay contact closure.</w:t>
+      </w:r>
+      <w:r>
+        <w:rPr>
+          <w:rFonts w:ascii="Calibri" w:hAnsi="Calibri"/>
+          <w:sz w:val="20"/>
+        </w:rPr>
         <w:br/>
         <w:t>• Detection Accuracy: 98.4% correct zone illumination across 1,500 test walkthroughs.</w:t>
+      </w:r>
+      <w:r>
+        <w:rPr>
+          <w:rFonts w:ascii="Calibri" w:hAnsi="Calibri"/>
+          <w:sz w:val="20"/>
+        </w:rPr>
         <w:br/>
-        <w:t>• Energy Savings: Achieved a 62.3% measured reduction in total lighting energy consumption during off-peak gallery hours compared to standard non-automated illumination.</w:t>
+        <w:t xml:space="preserve">• Energy Savings: Achieved a 62.3% measured reduction in total lighting energy consumption during off-peak </w:t>
+      </w:r>
+      <w:r>
+        <w:rPr>
+          <w:rFonts w:ascii="Calibri" w:hAnsi="Calibri"/>
+          <w:sz w:val="20"/>
+        </w:rPr>
+        <w:lastRenderedPageBreak/>
+        <w:t>gallery hours compared to standard non-automated illumination.</w:t>
+      </w:r>
+      <w:r>
+        <w:rPr>
+          <w:rFonts w:ascii="Calibri" w:hAnsi="Calibri"/>
+          <w:sz w:val="20"/>
+        </w:rPr>
         <w:br/>
         <w:t>• Thermal &amp; Electrical Stability: Zero false-triggering observed; optocoupler isolation successfully eliminated relay flyback spikes.</w:t>
       </w:r>
@@ -2290,20 +2458,149 @@
           <w:color w:val="999999"/>
         </w:rPr>
       </w:pPr>
-      <w:r/>
-      <w:r>
+      <w:r>
+        <w:rPr>
+          <w:noProof/>
+        </w:rPr>
         <w:drawing>
-          <wp:inline xmlns:a="http://schemas.openxmlformats.org/drawingml/2006/main" xmlns:pic="http://schemas.openxmlformats.org/drawingml/2006/picture">
+          <wp:inline distT="0" distB="0" distL="0" distR="0" wp14:anchorId="5A379FD3" wp14:editId="22FB471B">
             <wp:extent cx="2286000" cy="4953000"/>
+            <wp:effectExtent l="0" t="0" r="0" b="0"/>
             <wp:docPr id="2" name="Picture 2"/>
             <wp:cNvGraphicFramePr>
-              <a:graphicFrameLocks noChangeAspect="1"/>
+              <a:graphicFrameLocks xmlns:a="http://schemas.openxmlformats.org/drawingml/2006/main" noChangeAspect="1"/>
             </wp:cNvGraphicFramePr>
-            <a:graphic>
+            <a:graphic xmlns:a="http://schemas.openxmlformats.org/drawingml/2006/main">
               <a:graphicData uri="http://schemas.openxmlformats.org/drawingml/2006/picture">
-                <pic:pic>
+                <pic:pic xmlns:pic="http://schemas.openxmlformats.org/drawingml/2006/picture">
                   <pic:nvPicPr>
                     <pic:cNvPr id="0" name="PCB.jpg"/>
+                    <pic:cNvPicPr/>
+                  </pic:nvPicPr>
+                  <pic:blipFill>
+                    <a:blip r:embed="rId6"/>
+                    <a:stretch>
+                      <a:fillRect/>
+                    </a:stretch>
+                  </pic:blipFill>
+                  <pic:spPr>
+                    <a:xfrm>
+                      <a:off x="0" y="0"/>
+                      <a:ext cx="2286000" cy="4953000"/>
+                    </a:xfrm>
+                    <a:prstGeom prst="rect">
+                      <a:avLst/>
+                    </a:prstGeom>
+                  </pic:spPr>
+                </pic:pic>
+              </a:graphicData>
+            </a:graphic>
+          </wp:inline>
+        </w:drawing>
+      </w:r>
+      <w:r>
+        <w:t xml:space="preserve">   </w:t>
+      </w:r>
+      <w:r>
+        <w:rPr>
+          <w:noProof/>
+        </w:rPr>
+        <w:drawing>
+          <wp:inline distT="0" distB="0" distL="0" distR="0" wp14:anchorId="1CE3AE67" wp14:editId="65A665DB">
+            <wp:extent cx="2286000" cy="1285875"/>
+            <wp:effectExtent l="0" t="0" r="0" b="0"/>
+            <wp:docPr id="3" name="Picture 3"/>
+            <wp:cNvGraphicFramePr>
+              <a:graphicFrameLocks xmlns:a="http://schemas.openxmlformats.org/drawingml/2006/main" noChangeAspect="1"/>
+            </wp:cNvGraphicFramePr>
+            <a:graphic xmlns:a="http://schemas.openxmlformats.org/drawingml/2006/main">
+              <a:graphicData uri="http://schemas.openxmlformats.org/drawingml/2006/picture">
+                <pic:pic xmlns:pic="http://schemas.openxmlformats.org/drawingml/2006/picture">
+                  <pic:nvPicPr>
+                    <pic:cNvPr id="0" name="WhatsApp Image 2024-07-11 at 00.46.32_398825d0.jpg"/>
+                    <pic:cNvPicPr/>
+                  </pic:nvPicPr>
+                  <pic:blipFill>
+                    <a:blip r:embed="rId7"/>
+                    <a:stretch>
+                      <a:fillRect/>
+                    </a:stretch>
+                  </pic:blipFill>
+                  <pic:spPr>
+                    <a:xfrm>
+                      <a:off x="0" y="0"/>
+                      <a:ext cx="2286000" cy="1285875"/>
+                    </a:xfrm>
+                    <a:prstGeom prst="rect">
+                      <a:avLst/>
+                    </a:prstGeom>
+                  </pic:spPr>
+                </pic:pic>
+              </a:graphicData>
+            </a:graphic>
+          </wp:inline>
+        </w:drawing>
+      </w:r>
+    </w:p>
+    <w:p>
+      <w:pPr>
+        <w:pBdr>
+          <w:top w:val="dashed" w:sz="4" w:space="4" w:color="AAAAAA"/>
+          <w:left w:val="dashed" w:sz="4" w:space="4" w:color="AAAAAA"/>
+          <w:bottom w:val="dashed" w:sz="4" w:space="4" w:color="AAAAAA"/>
+          <w:right w:val="dashed" w:sz="4" w:space="4" w:color="AAAAAA"/>
+        </w:pBdr>
+        <w:spacing w:before="120" w:after="120"/>
+        <w:jc w:val="center"/>
+        <w:rPr>
+          <w:i/>
+          <w:iCs/>
+          <w:color w:val="999999"/>
+        </w:rPr>
+      </w:pPr>
+      <w:r>
+        <w:rPr>
+          <w:rFonts w:ascii="Calibri" w:hAnsi="Calibri"/>
+          <w:i/>
+          <w:sz w:val="18"/>
+        </w:rPr>
+        <w:t>Figure 2: Component Mounting PCB Assembly (Left) &amp; Relay Wiring Conduits (Right)</w:t>
+      </w:r>
+    </w:p>
+    <w:p>
+      <w:pPr>
+        <w:pBdr>
+          <w:top w:val="dashed" w:sz="4" w:space="4" w:color="AAAAAA"/>
+          <w:left w:val="dashed" w:sz="4" w:space="4" w:color="AAAAAA"/>
+          <w:bottom w:val="dashed" w:sz="4" w:space="4" w:color="AAAAAA"/>
+          <w:right w:val="dashed" w:sz="4" w:space="4" w:color="AAAAAA"/>
+        </w:pBdr>
+        <w:spacing w:before="120" w:after="120"/>
+        <w:jc w:val="center"/>
+        <w:rPr>
+          <w:i/>
+          <w:iCs/>
+          <w:color w:val="999999"/>
+        </w:rPr>
+      </w:pPr>
+      <w:r>
+        <w:rPr>
+          <w:noProof/>
+        </w:rPr>
+        <w:lastRenderedPageBreak/>
+        <w:drawing>
+          <wp:inline distT="0" distB="0" distL="0" distR="0" wp14:anchorId="3B9E647E" wp14:editId="4681F8C2">
+            <wp:extent cx="2560320" cy="1181686"/>
+            <wp:effectExtent l="0" t="0" r="0" b="0"/>
+            <wp:docPr id="4" name="Picture 4"/>
+            <wp:cNvGraphicFramePr>
+              <a:graphicFrameLocks xmlns:a="http://schemas.openxmlformats.org/drawingml/2006/main" noChangeAspect="1"/>
+            </wp:cNvGraphicFramePr>
+            <a:graphic xmlns:a="http://schemas.openxmlformats.org/drawingml/2006/main">
+              <a:graphicData uri="http://schemas.openxmlformats.org/drawingml/2006/picture">
+                <pic:pic xmlns:pic="http://schemas.openxmlformats.org/drawingml/2006/picture">
+                  <pic:nvPicPr>
+                    <pic:cNvPr id="0" name="soldering.jpg"/>
                     <pic:cNvPicPr/>
                   </pic:nvPicPr>
                   <pic:blipFill>
@@ -2315,42 +2612,11 @@
                   <pic:spPr>
                     <a:xfrm>
                       <a:off x="0" y="0"/>
-                      <a:ext cx="2286000" cy="4953000"/>
+                      <a:ext cx="2560320" cy="1181686"/>
                     </a:xfrm>
-                    <a:prstGeom prst="rect"/>
-                  </pic:spPr>
-                </pic:pic>
-              </a:graphicData>
-            </a:graphic>
-          </wp:inline>
-        </w:drawing>
-        <w:t xml:space="preserve">   </w:t>
-        <w:drawing>
-          <wp:inline xmlns:a="http://schemas.openxmlformats.org/drawingml/2006/main" xmlns:pic="http://schemas.openxmlformats.org/drawingml/2006/picture">
-            <wp:extent cx="2286000" cy="1285875"/>
-            <wp:docPr id="3" name="Picture 3"/>
-            <wp:cNvGraphicFramePr>
-              <a:graphicFrameLocks noChangeAspect="1"/>
-            </wp:cNvGraphicFramePr>
-            <a:graphic>
-              <a:graphicData uri="http://schemas.openxmlformats.org/drawingml/2006/picture">
-                <pic:pic>
-                  <pic:nvPicPr>
-                    <pic:cNvPr id="0" name="WhatsApp Image 2024-07-11 at 00.46.32_398825d0.jpg"/>
-                    <pic:cNvPicPr/>
-                  </pic:nvPicPr>
-                  <pic:blipFill>
-                    <a:blip r:embed="rId9"/>
-                    <a:stretch>
-                      <a:fillRect/>
-                    </a:stretch>
-                  </pic:blipFill>
-                  <pic:spPr>
-                    <a:xfrm>
-                      <a:off x="0" y="0"/>
-                      <a:ext cx="2286000" cy="1285875"/>
-                    </a:xfrm>
-                    <a:prstGeom prst="rect"/>
+                    <a:prstGeom prst="rect">
+                      <a:avLst/>
+                    </a:prstGeom>
                   </pic:spPr>
                 </pic:pic>
               </a:graphicData>
@@ -2369,92 +2635,13 @@
         </w:pBdr>
         <w:spacing w:before="120" w:after="120"/>
         <w:jc w:val="center"/>
-        <w:rPr>
-          <w:i/>
-          <w:iCs/>
-          <w:color w:val="999999"/>
-        </w:rPr>
       </w:pPr>
       <w:r>
         <w:rPr>
           <w:rFonts w:ascii="Calibri" w:hAnsi="Calibri"/>
-          <w:b w:val="0"/>
           <w:i/>
           <w:sz w:val="18"/>
         </w:rPr>
-        <w:t>Figure 2: Component Mounting PCB Assembly (Left) &amp; Relay Wiring Conduits (Right)</w:t>
-      </w:r>
-    </w:p>
-    <w:p>
-      <w:pPr>
-        <w:pBdr>
-          <w:top w:val="dashed" w:sz="4" w:space="4" w:color="AAAAAA"/>
-          <w:left w:val="dashed" w:sz="4" w:space="4" w:color="AAAAAA"/>
-          <w:bottom w:val="dashed" w:sz="4" w:space="4" w:color="AAAAAA"/>
-          <w:right w:val="dashed" w:sz="4" w:space="4" w:color="AAAAAA"/>
-        </w:pBdr>
-        <w:spacing w:before="120" w:after="120"/>
-        <w:jc w:val="center"/>
-        <w:rPr>
-          <w:i/>
-          <w:iCs/>
-          <w:color w:val="999999"/>
-        </w:rPr>
-      </w:pPr>
-      <w:r/>
-      <w:r>
-        <w:drawing>
-          <wp:inline xmlns:a="http://schemas.openxmlformats.org/drawingml/2006/main" xmlns:pic="http://schemas.openxmlformats.org/drawingml/2006/picture">
-            <wp:extent cx="2560320" cy="1181686"/>
-            <wp:docPr id="4" name="Picture 4"/>
-            <wp:cNvGraphicFramePr>
-              <a:graphicFrameLocks noChangeAspect="1"/>
-            </wp:cNvGraphicFramePr>
-            <a:graphic>
-              <a:graphicData uri="http://schemas.openxmlformats.org/drawingml/2006/picture">
-                <pic:pic>
-                  <pic:nvPicPr>
-                    <pic:cNvPr id="0" name="soldering.jpg"/>
-                    <pic:cNvPicPr/>
-                  </pic:nvPicPr>
-                  <pic:blipFill>
-                    <a:blip r:embed="rId10"/>
-                    <a:stretch>
-                      <a:fillRect/>
-                    </a:stretch>
-                  </pic:blipFill>
-                  <pic:spPr>
-                    <a:xfrm>
-                      <a:off x="0" y="0"/>
-                      <a:ext cx="2560320" cy="1181686"/>
-                    </a:xfrm>
-                    <a:prstGeom prst="rect"/>
-                  </pic:spPr>
-                </pic:pic>
-              </a:graphicData>
-            </a:graphic>
-          </wp:inline>
-        </w:drawing>
-      </w:r>
-    </w:p>
-    <w:p>
-      <w:pPr>
-        <w:pBdr>
-          <w:top w:val="dashed" w:sz="4" w:space="4" w:color="AAAAAA"/>
-          <w:left w:val="dashed" w:sz="4" w:space="4" w:color="AAAAAA"/>
-          <w:bottom w:val="dashed" w:sz="4" w:space="4" w:color="AAAAAA"/>
-          <w:right w:val="dashed" w:sz="4" w:space="4" w:color="AAAAAA"/>
-        </w:pBdr>
-        <w:spacing w:before="120" w:after="120"/>
-        <w:jc w:val="center"/>
-      </w:pPr>
-      <w:r>
-        <w:rPr>
-          <w:rFonts w:ascii="Calibri" w:hAnsi="Calibri"/>
-          <w:b w:val="0"/>
-          <w:i/>
-          <w:sz w:val="18"/>
-        </w:rPr>
         <w:t>Figure 3: Enclosure Fabrication and Soldering Phase</w:t>
       </w:r>
     </w:p>
@@ -2464,7 +2651,6 @@
         <w:pStyle w:val="Heading1"/>
       </w:pPr>
       <w:r>
-        <w:lastRenderedPageBreak/>
         <w:t>7. Challenges, Learnings &amp; Future Improvements</w:t>
       </w:r>
     </w:p>
@@ -2501,13 +2687,23 @@
       <w:r>
         <w:rPr>
           <w:rFonts w:ascii="Calibri" w:hAnsi="Calibri"/>
-          <w:b w:val="0"/>
-          <w:i w:val="0"/>
           <w:sz w:val="20"/>
         </w:rPr>
         <w:t>1. Optical Noise &amp; Fluorescent Interference: Ambient indoor lighting initially caused small analog ADC jitter; resolved by introducing mathematical moving-average filtering and physical optical hoods.</w:t>
+      </w:r>
+      <w:r>
+        <w:rPr>
+          <w:rFonts w:ascii="Calibri" w:hAnsi="Calibri"/>
+          <w:sz w:val="20"/>
+        </w:rPr>
         <w:br/>
         <w:t>2. High-Voltage Inductive Spikes: Switching 220V AC spotlights generated electromagnetic interference (EMI); solved using optocoupler-isolated relays and snubber filtering on the AC lines.</w:t>
+      </w:r>
+      <w:r>
+        <w:rPr>
+          <w:rFonts w:ascii="Calibri" w:hAnsi="Calibri"/>
+          <w:sz w:val="20"/>
+        </w:rPr>
         <w:br/>
         <w:t>3. Zone Boundary Hysteresis: Visitors standing between two art pieces caused rapid relay toggling; addressed by implementing a 15cm deadband hysteresis in the firmware state machine.</w:t>
       </w:r>
@@ -2568,18 +2764,46 @@
       <w:r>
         <w:rPr>
           <w:rFonts w:ascii="Calibri" w:hAnsi="Calibri"/>
-          <w:b w:val="0"/>
-          <w:i w:val="0"/>
           <w:sz w:val="20"/>
         </w:rPr>
         <w:t>Summary: Successfully built and deployed an autonomous, energy-efficient gallery lighting system that combines physical sensor tracking, edge computing, and high-voltage power switching on the Arduino UNO Q platform.</w:t>
+      </w:r>
+      <w:r>
+        <w:rPr>
+          <w:rFonts w:ascii="Calibri" w:hAnsi="Calibri"/>
+          <w:sz w:val="20"/>
+        </w:rPr>
         <w:br/>
+      </w:r>
+      <w:r>
+        <w:rPr>
+          <w:rFonts w:ascii="Calibri" w:hAnsi="Calibri"/>
+          <w:sz w:val="20"/>
+        </w:rPr>
         <w:br/>
         <w:t>Future Improvements:</w:t>
+      </w:r>
+      <w:r>
+        <w:rPr>
+          <w:rFonts w:ascii="Calibri" w:hAnsi="Calibri"/>
+          <w:sz w:val="20"/>
+        </w:rPr>
         <w:br/>
         <w:t>1. Microprocessor (MPU) Vision Enhancement: Utilize the Uno Q's Linux MPU core to run an onboard camera for visitor gaze tracking and artwork dwell-time analytics.</w:t>
+      </w:r>
+      <w:r>
+        <w:rPr>
+          <w:rFonts w:ascii="Calibri" w:hAnsi="Calibri"/>
+          <w:sz w:val="20"/>
+        </w:rPr>
         <w:br/>
         <w:t>2. Cloud Energy Telemetry: Stream real-time power savings and footfall data to an IoT cloud dashboard via MQTT / Wi-Fi.</w:t>
+      </w:r>
+      <w:r>
+        <w:rPr>
+          <w:rFonts w:ascii="Calibri" w:hAnsi="Calibri"/>
+          <w:sz w:val="20"/>
+        </w:rPr>
         <w:br/>
         <w:t>3. DMX512 Smooth Dimming: Transition from mechanical on/off relays to DMX512 theatrical dimmers for smooth fading transitions between spotlights.</w:t>
       </w:r>
@@ -2618,11 +2842,16 @@
       </w:r>
     </w:p>
     <w:p/>
+    <w:p/>
+    <w:p/>
+    <w:p/>
+    <w:p/>
     <w:p>
       <w:pPr>
         <w:pStyle w:val="Heading1"/>
       </w:pPr>
       <w:r>
+        <w:lastRenderedPageBreak/>
         <w:t>8. Declaration</w:t>
       </w:r>
     </w:p>
@@ -2707,7 +2936,13 @@
           </w:tcPr>
           <w:p>
             <w:r>
-              <w:t>24 August 2026</w:t>
+              <w:t>2</w:t>
+            </w:r>
+            <w:r>
+              <w:t>3</w:t>
+            </w:r>
+            <w:r>
+              <w:t xml:space="preserve"> August 2026</w:t>
             </w:r>
           </w:p>
         </w:tc>
@@ -3380,7 +3615,6 @@
   <w:style w:type="character" w:default="1" w:styleId="DefaultParagraphFont">
     <w:name w:val="Default Paragraph Font"/>
     <w:uiPriority w:val="1"/>
-    <w:semiHidden/>
     <w:unhideWhenUsed/>
   </w:style>
   <w:style w:type="table" w:default="1" w:styleId="TableNormal">
@@ -3494,6 +3728,18 @@
     <w:rPr>
       <w:sz w:val="20"/>
       <w:szCs w:val="20"/>
+    </w:rPr>
+  </w:style>
+  <w:style w:type="character" w:styleId="UnresolvedMention">
+    <w:name w:val="Unresolved Mention"/>
+    <w:basedOn w:val="DefaultParagraphFont"/>
+    <w:uiPriority w:val="99"/>
+    <w:semiHidden/>
+    <w:unhideWhenUsed/>
+    <w:rsid w:val="00457784"/>
+    <w:rPr>
+      <w:color w:val="605E5C"/>
+      <w:shd w:val="clear" w:color="auto" w:fill="E1DFDD"/>
     </w:rPr>
   </w:style>
 </w:styles>

</xml_diff>